<commit_message>
ux(nav): regroup sidebar accordion into 11 logical blocks (v1.44.0)
Sections now match their block names. New «Обзор» (dashboard, status report, portfolio);
«Бэклог и приоритизация» and «Расписание и зависимости» split out; «Команда» consolidates
people (roles, skills, bus factor, stakeholders, HR); «Аналитика и качество» merges metrics
with risk/defects/incidents; «Церемонии» keeps only Scrum events, with health & improvement
moved to «Здоровье и улучшения»; «Настройки» renamed «Система». Empty «Персонал» folded in.

All 56 sections preserved (no dup/loss). Backend unchanged. Frontend e2e 93/93 (+NAV-integrity).
Deliverables bumped to 1.44.0; architecture doc regenerated (49 tables incl. V11); frontend/docs synced.

Co-Authored-By: Claude Opus 4.8 <noreply@anthropic.com>
</commit_message>
<xml_diff>
--- a/Архитектура_приложения.docx
+++ b/Архитектура_приложения.docx
@@ -15,7 +15,7 @@
         <w:rPr>
           <w:i/>
         </w:rPr>
-        <w:t>Управление кросс-функциональной командой · v1.42.0</w:t>
+        <w:t>Управление кросс-функциональной командой · v1.44.0</w:t>
       </w:r>
     </w:p>
     <w:p>
@@ -728,7 +728,7 @@
     </w:p>
     <w:p>
       <w:r>
-        <w:t>PostgreSQL хранит 46 таблиц по доменам. Всё состояние — единый снимок GET/PUT /api/state с оптимистичной блокировкой (app_meta). Связи логические (по строковым id). Схема — Flyway V1–V10.</w:t>
+        <w:t>PostgreSQL хранит 49 таблиц по доменам. Всё состояние — единый снимок GET/PUT /api/state с оптимистичной блокировкой (app_meta). Связи логические (по строковым id). Схема — Flyway V1–V11.</w:t>
       </w:r>
     </w:p>
     <w:p>
@@ -1038,6 +1038,28 @@
           </w:p>
         </w:tc>
       </w:tr>
+      <w:tr>
+        <w:tc>
+          <w:tcPr>
+            <w:tcW w:type="dxa" w:w="4680"/>
+          </w:tcPr>
+          <w:p>
+            <w:r>
+              <w:t>V11</w:t>
+            </w:r>
+          </w:p>
+        </w:tc>
+        <w:tc>
+          <w:tcPr>
+            <w:tcW w:type="dxa" w:w="4680"/>
+          </w:tcPr>
+          <w:p>
+            <w:r>
+              <w:t>Team Health Check, деплои и инциденты (DORA)</w:t>
+            </w:r>
+          </w:p>
+        </w:tc>
+      </w:tr>
     </w:tbl>
     <w:p>
       <w:pPr>
@@ -3520,6 +3542,162 @@
           <w:p>
             <w:r>
               <w:t>Портфель проектов</w:t>
+            </w:r>
+          </w:p>
+        </w:tc>
+      </w:tr>
+      <w:tr>
+        <w:tc>
+          <w:tcPr>
+            <w:tcW w:type="dxa" w:w="1872"/>
+          </w:tcPr>
+          <w:p>
+            <w:r>
+              <w:t>team_health</w:t>
+            </w:r>
+          </w:p>
+        </w:tc>
+        <w:tc>
+          <w:tcPr>
+            <w:tcW w:type="dxa" w:w="1872"/>
+          </w:tcPr>
+          <w:p>
+            <w:r>
+              <w:t>Церемонии</w:t>
+            </w:r>
+          </w:p>
+        </w:tc>
+        <w:tc>
+          <w:tcPr>
+            <w:tcW w:type="dxa" w:w="1872"/>
+          </w:tcPr>
+          <w:p>
+            <w:r>
+              <w:t>2</w:t>
+            </w:r>
+          </w:p>
+        </w:tc>
+        <w:tc>
+          <w:tcPr>
+            <w:tcW w:type="dxa" w:w="1872"/>
+          </w:tcPr>
+          <w:p>
+            <w:r>
+              <w:t>pk, dimension</w:t>
+            </w:r>
+          </w:p>
+        </w:tc>
+        <w:tc>
+          <w:tcPr>
+            <w:tcW w:type="dxa" w:w="1872"/>
+          </w:tcPr>
+          <w:p>
+            <w:r>
+              <w:t>Team Health Check (Spotify Squad): оценки измерений здоровья команды</w:t>
+            </w:r>
+          </w:p>
+        </w:tc>
+      </w:tr>
+      <w:tr>
+        <w:tc>
+          <w:tcPr>
+            <w:tcW w:type="dxa" w:w="1872"/>
+          </w:tcPr>
+          <w:p>
+            <w:r>
+              <w:t>deployments</w:t>
+            </w:r>
+          </w:p>
+        </w:tc>
+        <w:tc>
+          <w:tcPr>
+            <w:tcW w:type="dxa" w:w="1872"/>
+          </w:tcPr>
+          <w:p>
+            <w:r>
+              <w:t>Выпуск</w:t>
+            </w:r>
+          </w:p>
+        </w:tc>
+        <w:tc>
+          <w:tcPr>
+            <w:tcW w:type="dxa" w:w="1872"/>
+          </w:tcPr>
+          <w:p>
+            <w:r>
+              <w:t>2</w:t>
+            </w:r>
+          </w:p>
+        </w:tc>
+        <w:tc>
+          <w:tcPr>
+            <w:tcW w:type="dxa" w:w="1872"/>
+          </w:tcPr>
+          <w:p>
+            <w:r>
+              <w:t>pk, status</w:t>
+            </w:r>
+          </w:p>
+        </w:tc>
+        <w:tc>
+          <w:tcPr>
+            <w:tcW w:type="dxa" w:w="1872"/>
+          </w:tcPr>
+          <w:p>
+            <w:r>
+              <w:t>Деплои — для DORA (частота, lead time, change failure rate)</w:t>
+            </w:r>
+          </w:p>
+        </w:tc>
+      </w:tr>
+      <w:tr>
+        <w:tc>
+          <w:tcPr>
+            <w:tcW w:type="dxa" w:w="1872"/>
+          </w:tcPr>
+          <w:p>
+            <w:r>
+              <w:t>incidents</w:t>
+            </w:r>
+          </w:p>
+        </w:tc>
+        <w:tc>
+          <w:tcPr>
+            <w:tcW w:type="dxa" w:w="1872"/>
+          </w:tcPr>
+          <w:p>
+            <w:r>
+              <w:t>Аналитика</w:t>
+            </w:r>
+          </w:p>
+        </w:tc>
+        <w:tc>
+          <w:tcPr>
+            <w:tcW w:type="dxa" w:w="1872"/>
+          </w:tcPr>
+          <w:p>
+            <w:r>
+              <w:t>2</w:t>
+            </w:r>
+          </w:p>
+        </w:tc>
+        <w:tc>
+          <w:tcPr>
+            <w:tcW w:type="dxa" w:w="1872"/>
+          </w:tcPr>
+          <w:p>
+            <w:r>
+              <w:t>pk, down_hours</w:t>
+            </w:r>
+          </w:p>
+        </w:tc>
+        <w:tc>
+          <w:tcPr>
+            <w:tcW w:type="dxa" w:w="1872"/>
+          </w:tcPr>
+          <w:p>
+            <w:r>
+              <w:t>Прод-инциденты и постмортемы — MTTR для DORA</w:t>
             </w:r>
           </w:p>
         </w:tc>
@@ -3591,7 +3769,7 @@
         <w:rPr>
           <w:i/>
         </w:rPr>
-        <w:t>Сгенерировано для приложения «Управление кросс-функциональной командой» v1.42.0.</w:t>
+        <w:t>Сгенерировано для приложения «Управление кросс-функциональной командой» v1.44.0.</w:t>
       </w:r>
     </w:p>
     <w:sectPr>

</xml_diff>